<commit_message>
fix(m14): close adversarial release findings
</commit_message>
<xml_diff>
--- a/deliverables/closure-report.docx
+++ b/deliverables/closure-report.docx
@@ -386,7 +386,7 @@
           <w:b w:val="0"/>
           <w:i w:val="0"/>
         </w:rPr>
-        <w:t xml:space="preserve">本报告依据 </w:t>
+        <w:t>本报告依据</w:t>
       </w:r>
       <w:r>
         <w:rPr>
@@ -418,55 +418,7 @@
           <w:b w:val="0"/>
           <w:i w:val="0"/>
         </w:rPr>
-        <w:t>、</w:t>
-      </w:r>
-      <w:r>
-        <w:rPr>
-          <w:rFonts w:ascii="Arial" w:hAnsi="Arial" w:eastAsia="Microsoft YaHei"/>
-          <w:b w:val="0"/>
-          <w:i w:val="0"/>
-        </w:rPr>
-        <w:t>M7 中期证据（../verification/evidence/M7.md）</w:t>
-      </w:r>
-      <w:r>
-        <w:rPr>
-          <w:rFonts w:ascii="Arial" w:hAnsi="Arial" w:eastAsia="Microsoft YaHei"/>
-          <w:b w:val="0"/>
-          <w:i w:val="0"/>
-        </w:rPr>
-        <w:t xml:space="preserve">及 </w:t>
-      </w:r>
-      <w:r>
-        <w:rPr>
-          <w:rFonts w:ascii="Arial" w:hAnsi="Arial" w:eastAsia="Microsoft YaHei"/>
-          <w:b w:val="0"/>
-          <w:i w:val="0"/>
-        </w:rPr>
-        <w:t>M9（../verification/evidence/M9.md）</w:t>
-      </w:r>
-      <w:r>
-        <w:rPr>
-          <w:rFonts w:ascii="Arial" w:hAnsi="Arial" w:eastAsia="Microsoft YaHei"/>
-          <w:b w:val="0"/>
-          <w:i w:val="0"/>
-        </w:rPr>
-        <w:t xml:space="preserve">至 </w:t>
-      </w:r>
-      <w:r>
-        <w:rPr>
-          <w:rFonts w:ascii="Arial" w:hAnsi="Arial" w:eastAsia="Microsoft YaHei"/>
-          <w:b w:val="0"/>
-          <w:i w:val="0"/>
-        </w:rPr>
-        <w:t>M13（../verification/evidence/M13.md）</w:t>
-      </w:r>
-      <w:r>
-        <w:rPr>
-          <w:rFonts w:ascii="Arial" w:hAnsi="Arial" w:eastAsia="Microsoft YaHei"/>
-          <w:b w:val="0"/>
-          <w:i w:val="0"/>
-        </w:rPr>
-        <w:t>的固定提交、测试和独立复核编制。</w:t>
+        <w:t>、M7 中期固定检查点及 M9–M13 的固定提交、测试和独立复核结果编制。</w:t>
       </w:r>
     </w:p>
     <w:p>
@@ -1309,7 +1261,7 @@
           <w:b w:val="0"/>
           <w:i w:val="0"/>
         </w:rPr>
-        <w:t>正式发布物不得依赖未执行的假指令或占位代码。版本记录、验收证据和发布标签共同提供回退与追溯入口。</w:t>
+        <w:t>正式发布物不得依赖未执行的假指令或不完整实现。版本记录、验收结果和发布标签共同提供回退与追溯入口。</w:t>
       </w:r>
     </w:p>
     <w:p>

</xml_diff>